<commit_message>
module 2 hw fixed
</commit_message>
<xml_diff>
--- a/ROI_Analysis.docx
+++ b/ROI_Analysis.docx
@@ -1787,47 +1787,593 @@
           <w:sz w:val="22"/>
           <w:szCs w:val="22"/>
         </w:rPr>
-        <w:t>Using the reference baseline: one full manual validation cycle (3 targets plus report) is about 7</w:t>
-      </w:r>
-      <w:r>
-        <w:rPr>
-          <w:sz w:val="22"/>
-          <w:szCs w:val="22"/>
-        </w:rPr>
-        <w:t>h</w:t>
-      </w:r>
-      <w:r>
-        <w:rPr>
-          <w:sz w:val="22"/>
-          <w:szCs w:val="22"/>
-        </w:rPr>
-        <w:t>.</w:t>
+        <w:t>Manual validation steps per cycle:</w:t>
       </w:r>
     </w:p>
     <w:p>
       <w:pPr>
-        <w:rPr>
-          <w:sz w:val="22"/>
-          <w:szCs w:val="22"/>
-        </w:rPr>
-      </w:pPr>
-      <w:r>
-        <w:rPr>
-          <w:sz w:val="22"/>
-          <w:szCs w:val="22"/>
-        </w:rPr>
-        <w:t>A</w:t>
-      </w:r>
-      <w:r>
-        <w:rPr>
-          <w:sz w:val="22"/>
-          <w:szCs w:val="22"/>
-        </w:rPr>
-        <w:t xml:space="preserve">ssumption on cadence: I estimate validation would realistically happen twice per week, not daily. </w:t>
+        <w:numPr>
+          <w:ilvl w:val="0"/>
+          <w:numId w:val="1"/>
+        </w:numPr>
+        <w:rPr>
+          <w:sz w:val="22"/>
+          <w:szCs w:val="22"/>
+        </w:rPr>
+      </w:pPr>
+      <w:r>
+        <w:rPr>
+          <w:sz w:val="22"/>
+          <w:szCs w:val="22"/>
+        </w:rPr>
+        <w:t>Recompute aggregates in Postgres</w:t>
+      </w:r>
+      <w:r>
+        <w:rPr>
+          <w:sz w:val="22"/>
+          <w:szCs w:val="22"/>
+        </w:rPr>
+        <w:t xml:space="preserve"> by</w:t>
+      </w:r>
+      <w:r>
+        <w:rPr>
+          <w:sz w:val="22"/>
+          <w:szCs w:val="22"/>
+        </w:rPr>
+        <w:t xml:space="preserve"> run</w:t>
+      </w:r>
+      <w:r>
+        <w:rPr>
+          <w:sz w:val="22"/>
+          <w:szCs w:val="22"/>
+        </w:rPr>
+        <w:t>ning</w:t>
+      </w:r>
+      <w:r>
+        <w:rPr>
+          <w:sz w:val="22"/>
+          <w:szCs w:val="22"/>
+        </w:rPr>
+        <w:t> GROUP BY against the source</w:t>
+      </w:r>
+      <w:r>
+        <w:rPr>
+          <w:sz w:val="22"/>
+          <w:szCs w:val="22"/>
+        </w:rPr>
+        <w:t xml:space="preserve">s </w:t>
+      </w:r>
+      <w:r>
+        <w:rPr>
+          <w:sz w:val="22"/>
+          <w:szCs w:val="22"/>
+        </w:rPr>
+        <w:t xml:space="preserve">to calculate </w:t>
+      </w:r>
+      <w:proofErr w:type="gramStart"/>
+      <w:r>
+        <w:rPr>
+          <w:sz w:val="22"/>
+          <w:szCs w:val="22"/>
+        </w:rPr>
+        <w:t>MIN(</w:t>
+      </w:r>
+      <w:proofErr w:type="spellStart"/>
+      <w:proofErr w:type="gramEnd"/>
+      <w:r>
+        <w:rPr>
+          <w:sz w:val="22"/>
+          <w:szCs w:val="22"/>
+        </w:rPr>
+        <w:t>duration_minutes</w:t>
+      </w:r>
+      <w:proofErr w:type="spellEnd"/>
+      <w:r>
+        <w:rPr>
+          <w:sz w:val="22"/>
+          <w:szCs w:val="22"/>
+        </w:rPr>
+        <w:t xml:space="preserve">), </w:t>
+      </w:r>
+      <w:proofErr w:type="gramStart"/>
+      <w:r>
+        <w:rPr>
+          <w:sz w:val="22"/>
+          <w:szCs w:val="22"/>
+        </w:rPr>
+        <w:t>AVG(</w:t>
+      </w:r>
+      <w:proofErr w:type="spellStart"/>
+      <w:proofErr w:type="gramEnd"/>
+      <w:r>
+        <w:rPr>
+          <w:sz w:val="22"/>
+          <w:szCs w:val="22"/>
+        </w:rPr>
+        <w:t>duration_minutes</w:t>
+      </w:r>
+      <w:proofErr w:type="spellEnd"/>
+      <w:r>
+        <w:rPr>
+          <w:sz w:val="22"/>
+          <w:szCs w:val="22"/>
+        </w:rPr>
+        <w:t xml:space="preserve">), and </w:t>
+      </w:r>
+      <w:proofErr w:type="gramStart"/>
+      <w:r>
+        <w:rPr>
+          <w:sz w:val="22"/>
+          <w:szCs w:val="22"/>
+        </w:rPr>
+        <w:t>SUM(</w:t>
+      </w:r>
+      <w:proofErr w:type="spellStart"/>
+      <w:proofErr w:type="gramEnd"/>
+      <w:r>
+        <w:rPr>
+          <w:sz w:val="22"/>
+          <w:szCs w:val="22"/>
+        </w:rPr>
+        <w:t>treatment_cost</w:t>
+      </w:r>
+      <w:proofErr w:type="spellEnd"/>
+      <w:r>
+        <w:rPr>
+          <w:sz w:val="22"/>
+          <w:szCs w:val="22"/>
+        </w:rPr>
+        <w:t xml:space="preserve">), then manually compare these numbers against each </w:t>
+      </w:r>
+      <w:r>
+        <w:rPr>
+          <w:sz w:val="22"/>
+          <w:szCs w:val="22"/>
+        </w:rPr>
+        <w:t>p</w:t>
+      </w:r>
+      <w:r>
+        <w:rPr>
+          <w:sz w:val="22"/>
+          <w:szCs w:val="22"/>
+        </w:rPr>
+        <w:t xml:space="preserve">arquet </w:t>
+      </w:r>
+      <w:r>
+        <w:rPr>
+          <w:sz w:val="22"/>
+          <w:szCs w:val="22"/>
+        </w:rPr>
+        <w:t xml:space="preserve">file </w:t>
+      </w:r>
+      <w:r>
+        <w:rPr>
+          <w:sz w:val="22"/>
+          <w:szCs w:val="22"/>
+        </w:rPr>
+        <w:t>values (1.5h)</w:t>
       </w:r>
     </w:p>
     <w:p>
       <w:pPr>
+        <w:numPr>
+          <w:ilvl w:val="0"/>
+          <w:numId w:val="1"/>
+        </w:numPr>
+        <w:rPr>
+          <w:sz w:val="22"/>
+          <w:szCs w:val="22"/>
+        </w:rPr>
+      </w:pPr>
+      <w:r>
+        <w:rPr>
+          <w:sz w:val="22"/>
+          <w:szCs w:val="22"/>
+        </w:rPr>
+        <w:t>Check nulls, duplicates and partitioning</w:t>
+      </w:r>
+      <w:r>
+        <w:rPr>
+          <w:sz w:val="22"/>
+          <w:szCs w:val="22"/>
+        </w:rPr>
+        <w:t xml:space="preserve"> by </w:t>
+      </w:r>
+      <w:r>
+        <w:rPr>
+          <w:sz w:val="22"/>
+          <w:szCs w:val="22"/>
+        </w:rPr>
+        <w:t>query</w:t>
+      </w:r>
+      <w:r>
+        <w:rPr>
+          <w:sz w:val="22"/>
+          <w:szCs w:val="22"/>
+        </w:rPr>
+        <w:t>ing</w:t>
+      </w:r>
+      <w:r>
+        <w:rPr>
+          <w:sz w:val="22"/>
+          <w:szCs w:val="22"/>
+        </w:rPr>
+        <w:t xml:space="preserve"> for NULL grouping keys, run a </w:t>
+      </w:r>
+      <w:proofErr w:type="gramStart"/>
+      <w:r>
+        <w:rPr>
+          <w:sz w:val="22"/>
+          <w:szCs w:val="22"/>
+        </w:rPr>
+        <w:t>COUNT(</w:t>
+      </w:r>
+      <w:proofErr w:type="gramEnd"/>
+      <w:r>
+        <w:rPr>
+          <w:sz w:val="22"/>
+          <w:szCs w:val="22"/>
+        </w:rPr>
+        <w:t xml:space="preserve">*) vs </w:t>
+      </w:r>
+      <w:proofErr w:type="gramStart"/>
+      <w:r>
+        <w:rPr>
+          <w:sz w:val="22"/>
+          <w:szCs w:val="22"/>
+        </w:rPr>
+        <w:t>COUNT(</w:t>
+      </w:r>
+      <w:proofErr w:type="gramEnd"/>
+      <w:r>
+        <w:rPr>
+          <w:sz w:val="22"/>
+          <w:szCs w:val="22"/>
+        </w:rPr>
+        <w:t xml:space="preserve">DISTINCT </w:t>
+      </w:r>
+      <w:proofErr w:type="spellStart"/>
+      <w:r>
+        <w:rPr>
+          <w:sz w:val="22"/>
+          <w:szCs w:val="22"/>
+        </w:rPr>
+        <w:t>column_name</w:t>
+      </w:r>
+      <w:proofErr w:type="spellEnd"/>
+      <w:r>
+        <w:rPr>
+          <w:sz w:val="22"/>
+          <w:szCs w:val="22"/>
+        </w:rPr>
+        <w:t>)</w:t>
+      </w:r>
+      <w:r>
+        <w:rPr>
+          <w:sz w:val="22"/>
+          <w:szCs w:val="22"/>
+        </w:rPr>
+        <w:t>.</w:t>
+      </w:r>
+      <w:r>
+        <w:rPr>
+          <w:sz w:val="22"/>
+          <w:szCs w:val="22"/>
+        </w:rPr>
+        <w:t xml:space="preserve"> </w:t>
+      </w:r>
+      <w:r>
+        <w:rPr>
+          <w:sz w:val="22"/>
+          <w:szCs w:val="22"/>
+        </w:rPr>
+        <w:t>M</w:t>
+      </w:r>
+      <w:r>
+        <w:rPr>
+          <w:sz w:val="22"/>
+          <w:szCs w:val="22"/>
+        </w:rPr>
+        <w:t>anually inspect the partition</w:t>
+      </w:r>
+      <w:r>
+        <w:rPr>
+          <w:sz w:val="22"/>
+          <w:szCs w:val="22"/>
+        </w:rPr>
+        <w:t xml:space="preserve"> </w:t>
+      </w:r>
+      <w:r>
+        <w:rPr>
+          <w:sz w:val="22"/>
+          <w:szCs w:val="22"/>
+        </w:rPr>
+        <w:t>structure to confirm correct</w:t>
+      </w:r>
+      <w:r>
+        <w:rPr>
+          <w:sz w:val="22"/>
+          <w:szCs w:val="22"/>
+        </w:rPr>
+        <w:t xml:space="preserve">ness </w:t>
+      </w:r>
+      <w:r>
+        <w:rPr>
+          <w:sz w:val="22"/>
+          <w:szCs w:val="22"/>
+        </w:rPr>
+        <w:t>(0.5h</w:t>
+      </w:r>
+      <w:r>
+        <w:rPr>
+          <w:sz w:val="22"/>
+          <w:szCs w:val="22"/>
+        </w:rPr>
+        <w:t xml:space="preserve"> per table</w:t>
+      </w:r>
+      <w:r>
+        <w:rPr>
+          <w:sz w:val="22"/>
+          <w:szCs w:val="22"/>
+        </w:rPr>
+        <w:t>).</w:t>
+      </w:r>
+    </w:p>
+    <w:p>
+      <w:pPr>
+        <w:numPr>
+          <w:ilvl w:val="0"/>
+          <w:numId w:val="1"/>
+        </w:numPr>
+        <w:rPr>
+          <w:sz w:val="22"/>
+          <w:szCs w:val="22"/>
+        </w:rPr>
+      </w:pPr>
+      <w:r>
+        <w:rPr>
+          <w:sz w:val="22"/>
+          <w:szCs w:val="22"/>
+        </w:rPr>
+        <w:t>Cross-check the HTML report</w:t>
+      </w:r>
+      <w:r>
+        <w:rPr>
+          <w:sz w:val="22"/>
+          <w:szCs w:val="22"/>
+        </w:rPr>
+        <w:t xml:space="preserve"> by</w:t>
+      </w:r>
+      <w:r>
+        <w:rPr>
+          <w:sz w:val="22"/>
+          <w:szCs w:val="22"/>
+        </w:rPr>
+        <w:t xml:space="preserve"> manually read</w:t>
+      </w:r>
+      <w:r>
+        <w:rPr>
+          <w:sz w:val="22"/>
+          <w:szCs w:val="22"/>
+        </w:rPr>
+        <w:t>ing</w:t>
+      </w:r>
+      <w:r>
+        <w:rPr>
+          <w:sz w:val="22"/>
+          <w:szCs w:val="22"/>
+        </w:rPr>
+        <w:t xml:space="preserve"> off the table values and </w:t>
+      </w:r>
+      <w:proofErr w:type="gramStart"/>
+      <w:r>
+        <w:rPr>
+          <w:sz w:val="22"/>
+          <w:szCs w:val="22"/>
+        </w:rPr>
+        <w:t>char</w:t>
+      </w:r>
+      <w:r>
+        <w:rPr>
+          <w:sz w:val="22"/>
+          <w:szCs w:val="22"/>
+        </w:rPr>
+        <w:t>ts</w:t>
+      </w:r>
+      <w:r>
+        <w:rPr>
+          <w:sz w:val="22"/>
+          <w:szCs w:val="22"/>
+        </w:rPr>
+        <w:t>, and</w:t>
+      </w:r>
+      <w:proofErr w:type="gramEnd"/>
+      <w:r>
+        <w:rPr>
+          <w:sz w:val="22"/>
+          <w:szCs w:val="22"/>
+        </w:rPr>
+        <w:t xml:space="preserve"> compar</w:t>
+      </w:r>
+      <w:r>
+        <w:rPr>
+          <w:sz w:val="22"/>
+          <w:szCs w:val="22"/>
+        </w:rPr>
+        <w:t>ing</w:t>
+      </w:r>
+      <w:r>
+        <w:rPr>
+          <w:sz w:val="22"/>
+          <w:szCs w:val="22"/>
+        </w:rPr>
+        <w:t xml:space="preserve"> them against the last 7 days of </w:t>
+      </w:r>
+      <w:r>
+        <w:rPr>
+          <w:sz w:val="22"/>
+          <w:szCs w:val="22"/>
+        </w:rPr>
+        <w:t>p</w:t>
+      </w:r>
+      <w:r>
+        <w:rPr>
+          <w:sz w:val="22"/>
+          <w:szCs w:val="22"/>
+        </w:rPr>
+        <w:t xml:space="preserve">arquet </w:t>
+      </w:r>
+      <w:proofErr w:type="gramStart"/>
+      <w:r>
+        <w:rPr>
+          <w:sz w:val="22"/>
+          <w:szCs w:val="22"/>
+        </w:rPr>
+        <w:t>data(</w:t>
+      </w:r>
+      <w:proofErr w:type="gramEnd"/>
+      <w:r>
+        <w:rPr>
+          <w:sz w:val="22"/>
+          <w:szCs w:val="22"/>
+        </w:rPr>
+        <w:t>1.0h).</w:t>
+      </w:r>
+    </w:p>
+    <w:p>
+      <w:pPr>
+        <w:numPr>
+          <w:ilvl w:val="0"/>
+          <w:numId w:val="1"/>
+        </w:numPr>
+        <w:rPr>
+          <w:sz w:val="22"/>
+          <w:szCs w:val="22"/>
+        </w:rPr>
+      </w:pPr>
+      <w:proofErr w:type="gramStart"/>
+      <w:r>
+        <w:rPr>
+          <w:sz w:val="22"/>
+          <w:szCs w:val="22"/>
+        </w:rPr>
+        <w:t xml:space="preserve">Document </w:t>
+      </w:r>
+      <w:r>
+        <w:rPr>
+          <w:sz w:val="22"/>
+          <w:szCs w:val="22"/>
+        </w:rPr>
+        <w:t xml:space="preserve"> by</w:t>
+      </w:r>
+      <w:proofErr w:type="gramEnd"/>
+      <w:r>
+        <w:rPr>
+          <w:sz w:val="22"/>
+          <w:szCs w:val="22"/>
+        </w:rPr>
+        <w:t xml:space="preserve"> </w:t>
+      </w:r>
+      <w:r>
+        <w:rPr>
+          <w:sz w:val="22"/>
+          <w:szCs w:val="22"/>
+        </w:rPr>
+        <w:t xml:space="preserve"> not</w:t>
+      </w:r>
+      <w:r>
+        <w:rPr>
+          <w:sz w:val="22"/>
+          <w:szCs w:val="22"/>
+        </w:rPr>
+        <w:t>ing</w:t>
+      </w:r>
+      <w:r>
+        <w:rPr>
+          <w:sz w:val="22"/>
+          <w:szCs w:val="22"/>
+        </w:rPr>
+        <w:t xml:space="preserve"> any mismatches found and decide if they need escalation (</w:t>
+      </w:r>
+      <w:r>
+        <w:rPr>
+          <w:sz w:val="22"/>
+          <w:szCs w:val="22"/>
+        </w:rPr>
+        <w:t>0.25h per issue</w:t>
+      </w:r>
+      <w:r>
+        <w:rPr>
+          <w:sz w:val="22"/>
+          <w:szCs w:val="22"/>
+        </w:rPr>
+        <w:t>).</w:t>
+      </w:r>
+    </w:p>
+    <w:p>
+      <w:pPr>
+        <w:rPr>
+          <w:b/>
+          <w:bCs/>
+          <w:sz w:val="22"/>
+          <w:szCs w:val="22"/>
+          <w:u w:val="single"/>
+        </w:rPr>
+      </w:pPr>
+    </w:p>
+    <w:p>
+      <w:pPr>
+        <w:rPr>
+          <w:sz w:val="22"/>
+          <w:szCs w:val="22"/>
+        </w:rPr>
+      </w:pPr>
+      <w:r>
+        <w:rPr>
+          <w:sz w:val="22"/>
+          <w:szCs w:val="22"/>
+        </w:rPr>
+        <w:t>Using the reference baseline: one full manual validation cycle (3 targets plus report) is about 7</w:t>
+      </w:r>
+      <w:r>
+        <w:rPr>
+          <w:sz w:val="22"/>
+          <w:szCs w:val="22"/>
+        </w:rPr>
+        <w:t>h</w:t>
+      </w:r>
+      <w:r>
+        <w:rPr>
+          <w:sz w:val="22"/>
+          <w:szCs w:val="22"/>
+        </w:rPr>
+        <w:t>.</w:t>
+      </w:r>
+    </w:p>
+    <w:p>
+      <w:pPr>
+        <w:rPr>
+          <w:sz w:val="22"/>
+          <w:szCs w:val="22"/>
+        </w:rPr>
+      </w:pPr>
+      <w:r>
+        <w:rPr>
+          <w:sz w:val="22"/>
+          <w:szCs w:val="22"/>
+        </w:rPr>
+        <w:t>A</w:t>
+      </w:r>
+      <w:r>
+        <w:rPr>
+          <w:sz w:val="22"/>
+          <w:szCs w:val="22"/>
+        </w:rPr>
+        <w:t xml:space="preserve">ssumption on cadence: I estimate validation would realistically happen twice per week, not daily. </w:t>
+      </w:r>
+    </w:p>
+    <w:p>
+      <w:pPr>
         <w:rPr>
           <w:sz w:val="22"/>
           <w:szCs w:val="22"/>
@@ -1927,6 +2473,7 @@
           <w:sz w:val="22"/>
           <w:szCs w:val="22"/>
         </w:rPr>
+        <w:lastRenderedPageBreak/>
         <w:t xml:space="preserve">Manual effort = 7h </w:t>
       </w:r>
       <w:r>
@@ -2123,7 +2670,21 @@
           <w:sz w:val="22"/>
           <w:szCs w:val="22"/>
         </w:rPr>
-        <w:t xml:space="preserve">Test development: 20 checks (3 targets </w:t>
+        <w:t>Test development: 2</w:t>
+      </w:r>
+      <w:r>
+        <w:rPr>
+          <w:sz w:val="22"/>
+          <w:szCs w:val="22"/>
+        </w:rPr>
+        <w:t xml:space="preserve">2 </w:t>
+      </w:r>
+      <w:r>
+        <w:rPr>
+          <w:sz w:val="22"/>
+          <w:szCs w:val="22"/>
+        </w:rPr>
+        <w:t xml:space="preserve">checks (3 targets </w:t>
       </w:r>
       <w:r>
         <w:rPr>
@@ -2223,7 +2784,21 @@
           <w:sz w:val="22"/>
           <w:szCs w:val="22"/>
         </w:rPr>
-        <w:t xml:space="preserve"> 24 checks total </w:t>
+        <w:t xml:space="preserve"> 2</w:t>
+      </w:r>
+      <w:r>
+        <w:rPr>
+          <w:sz w:val="22"/>
+          <w:szCs w:val="22"/>
+        </w:rPr>
+        <w:t>2</w:t>
+      </w:r>
+      <w:r>
+        <w:rPr>
+          <w:sz w:val="22"/>
+          <w:szCs w:val="22"/>
+        </w:rPr>
+        <w:t xml:space="preserve"> checks total </w:t>
       </w:r>
       <w:r>
         <w:rPr>
@@ -2265,7 +2840,21 @@
           <w:sz w:val="22"/>
           <w:szCs w:val="22"/>
         </w:rPr>
-        <w:t xml:space="preserve"> = 2400</w:t>
+        <w:t xml:space="preserve"> = 2</w:t>
+      </w:r>
+      <w:r>
+        <w:rPr>
+          <w:sz w:val="22"/>
+          <w:szCs w:val="22"/>
+        </w:rPr>
+        <w:t>2</w:t>
+      </w:r>
+      <w:r>
+        <w:rPr>
+          <w:sz w:val="22"/>
+          <w:szCs w:val="22"/>
+        </w:rPr>
+        <w:t>00</w:t>
       </w:r>
       <w:r>
         <w:rPr>
@@ -2287,7 +2876,21 @@
           <w:sz w:val="22"/>
           <w:szCs w:val="22"/>
         </w:rPr>
-        <w:t>Total one-off setup = 4400</w:t>
+        <w:t>Total one-off setup = 4</w:t>
+      </w:r>
+      <w:r>
+        <w:rPr>
+          <w:sz w:val="22"/>
+          <w:szCs w:val="22"/>
+        </w:rPr>
+        <w:t>2</w:t>
+      </w:r>
+      <w:r>
+        <w:rPr>
+          <w:sz w:val="22"/>
+          <w:szCs w:val="22"/>
+        </w:rPr>
+        <w:t>00</w:t>
       </w:r>
       <w:r>
         <w:rPr>
@@ -2309,7 +2912,6 @@
           <w:sz w:val="22"/>
           <w:szCs w:val="22"/>
         </w:rPr>
-        <w:lastRenderedPageBreak/>
         <w:t>Recurring annual costs:</w:t>
       </w:r>
     </w:p>
@@ -3041,6 +3643,7 @@
           <w:sz w:val="22"/>
           <w:szCs w:val="22"/>
         </w:rPr>
+        <w:lastRenderedPageBreak/>
         <w:t xml:space="preserve">Incidents prevented: </w:t>
       </w:r>
       <w:r>
@@ -3221,7 +3824,21 @@
                 <w:sz w:val="22"/>
                 <w:szCs w:val="22"/>
               </w:rPr>
-              <w:t>2400</w:t>
+              <w:t>2</w:t>
+            </w:r>
+            <w:r>
+              <w:rPr>
+                <w:sz w:val="22"/>
+                <w:szCs w:val="22"/>
+              </w:rPr>
+              <w:t>2</w:t>
+            </w:r>
+            <w:r>
+              <w:rPr>
+                <w:sz w:val="22"/>
+                <w:szCs w:val="22"/>
+              </w:rPr>
+              <w:t>00</w:t>
             </w:r>
           </w:p>
         </w:tc>
@@ -3363,7 +3980,21 @@
                 <w:sz w:val="22"/>
                 <w:szCs w:val="22"/>
               </w:rPr>
-              <w:t>7500</w:t>
+              <w:t>7</w:t>
+            </w:r>
+            <w:r>
+              <w:rPr>
+                <w:sz w:val="22"/>
+                <w:szCs w:val="22"/>
+              </w:rPr>
+              <w:t>3</w:t>
+            </w:r>
+            <w:r>
+              <w:rPr>
+                <w:sz w:val="22"/>
+                <w:szCs w:val="22"/>
+              </w:rPr>
+              <w:t>00</w:t>
             </w:r>
           </w:p>
         </w:tc>
@@ -3552,7 +4183,35 @@
                 <w:sz w:val="22"/>
                 <w:szCs w:val="22"/>
               </w:rPr>
-              <w:t xml:space="preserve">47200 − 7500) / 7500 </w:t>
+              <w:t xml:space="preserve">47200 − </w:t>
+            </w:r>
+            <w:r>
+              <w:rPr>
+                <w:sz w:val="22"/>
+                <w:szCs w:val="22"/>
+              </w:rPr>
+              <w:t>7300</w:t>
+            </w:r>
+            <w:r>
+              <w:rPr>
+                <w:sz w:val="22"/>
+                <w:szCs w:val="22"/>
+              </w:rPr>
+              <w:t xml:space="preserve">) / </w:t>
+            </w:r>
+            <w:r>
+              <w:rPr>
+                <w:sz w:val="22"/>
+                <w:szCs w:val="22"/>
+              </w:rPr>
+              <w:t>7300</w:t>
+            </w:r>
+            <w:r>
+              <w:rPr>
+                <w:sz w:val="22"/>
+                <w:szCs w:val="22"/>
+              </w:rPr>
+              <w:t xml:space="preserve"> </w:t>
             </w:r>
             <w:r>
               <w:rPr>
@@ -3573,7 +4232,14 @@
                 <w:sz w:val="22"/>
                 <w:szCs w:val="22"/>
               </w:rPr>
-              <w:t>529.3</w:t>
+              <w:t>5</w:t>
+            </w:r>
+            <w:r>
+              <w:rPr>
+                <w:sz w:val="22"/>
+                <w:szCs w:val="22"/>
+              </w:rPr>
+              <w:t>47</w:t>
             </w:r>
             <w:r>
               <w:rPr>
@@ -3705,7 +4371,21 @@
                 <w:sz w:val="22"/>
                 <w:szCs w:val="22"/>
               </w:rPr>
-              <w:t>4400</w:t>
+              <w:t>4</w:t>
+            </w:r>
+            <w:r>
+              <w:rPr>
+                <w:sz w:val="22"/>
+                <w:szCs w:val="22"/>
+              </w:rPr>
+              <w:t>2</w:t>
+            </w:r>
+            <w:r>
+              <w:rPr>
+                <w:sz w:val="22"/>
+                <w:szCs w:val="22"/>
+              </w:rPr>
+              <w:t>00</w:t>
             </w:r>
           </w:p>
         </w:tc>
@@ -3770,7 +4450,21 @@
                 <w:sz w:val="22"/>
                 <w:szCs w:val="22"/>
               </w:rPr>
-              <w:t>7500</w:t>
+              <w:t>7</w:t>
+            </w:r>
+            <w:r>
+              <w:rPr>
+                <w:sz w:val="22"/>
+                <w:szCs w:val="22"/>
+              </w:rPr>
+              <w:t>3</w:t>
+            </w:r>
+            <w:r>
+              <w:rPr>
+                <w:sz w:val="22"/>
+                <w:szCs w:val="22"/>
+              </w:rPr>
+              <w:t>00</w:t>
             </w:r>
           </w:p>
         </w:tc>
@@ -3882,7 +4576,21 @@
                 <w:sz w:val="22"/>
                 <w:szCs w:val="22"/>
               </w:rPr>
-              <w:t>13700</w:t>
+              <w:t>13</w:t>
+            </w:r>
+            <w:r>
+              <w:rPr>
+                <w:sz w:val="22"/>
+                <w:szCs w:val="22"/>
+              </w:rPr>
+              <w:t>5</w:t>
+            </w:r>
+            <w:r>
+              <w:rPr>
+                <w:sz w:val="22"/>
+                <w:szCs w:val="22"/>
+              </w:rPr>
+              <w:t>00</w:t>
             </w:r>
           </w:p>
         </w:tc>
@@ -4078,7 +4786,56 @@
                 <w:sz w:val="22"/>
                 <w:szCs w:val="22"/>
               </w:rPr>
-              <w:t xml:space="preserve">(141600 − 13700) / 13700 </w:t>
+              <w:t xml:space="preserve">(141600 − </w:t>
+            </w:r>
+            <w:r>
+              <w:rPr>
+                <w:sz w:val="22"/>
+                <w:szCs w:val="22"/>
+              </w:rPr>
+              <w:t>13</w:t>
+            </w:r>
+            <w:r>
+              <w:rPr>
+                <w:sz w:val="22"/>
+                <w:szCs w:val="22"/>
+              </w:rPr>
+              <w:t>5</w:t>
+            </w:r>
+            <w:r>
+              <w:rPr>
+                <w:sz w:val="22"/>
+                <w:szCs w:val="22"/>
+              </w:rPr>
+              <w:t>00</w:t>
+            </w:r>
+            <w:r>
+              <w:rPr>
+                <w:sz w:val="22"/>
+                <w:szCs w:val="22"/>
+              </w:rPr>
+              <w:t xml:space="preserve">) / </w:t>
+            </w:r>
+            <w:r>
+              <w:rPr>
+                <w:sz w:val="22"/>
+                <w:szCs w:val="22"/>
+              </w:rPr>
+              <w:t>13</w:t>
+            </w:r>
+            <w:r>
+              <w:rPr>
+                <w:sz w:val="22"/>
+                <w:szCs w:val="22"/>
+              </w:rPr>
+              <w:t>5</w:t>
+            </w:r>
+            <w:r>
+              <w:rPr>
+                <w:sz w:val="22"/>
+                <w:szCs w:val="22"/>
+              </w:rPr>
+              <w:t>00</w:t>
             </w:r>
             <w:r>
               <w:rPr>
@@ -4092,14 +4849,14 @@
                 <w:sz w:val="22"/>
                 <w:szCs w:val="22"/>
               </w:rPr>
-              <w:t xml:space="preserve"> 100 = 93</w:t>
-            </w:r>
-            <w:r>
-              <w:rPr>
-                <w:sz w:val="22"/>
-                <w:szCs w:val="22"/>
-              </w:rPr>
-              <w:t>3.6</w:t>
+              <w:t xml:space="preserve"> 100 = 9</w:t>
+            </w:r>
+            <w:r>
+              <w:rPr>
+                <w:sz w:val="22"/>
+                <w:szCs w:val="22"/>
+              </w:rPr>
+              <w:t>49</w:t>
             </w:r>
             <w:r>
               <w:rPr>
@@ -4139,7 +4896,21 @@
           <w:sz w:val="22"/>
           <w:szCs w:val="22"/>
         </w:rPr>
-        <w:t>) and test development (2400</w:t>
+        <w:t>) and test development (2</w:t>
+      </w:r>
+      <w:r>
+        <w:rPr>
+          <w:sz w:val="22"/>
+          <w:szCs w:val="22"/>
+        </w:rPr>
+        <w:t>2</w:t>
+      </w:r>
+      <w:r>
+        <w:rPr>
+          <w:sz w:val="22"/>
+          <w:szCs w:val="22"/>
+        </w:rPr>
+        <w:t>00</w:t>
       </w:r>
       <w:r>
         <w:rPr>
@@ -4373,35 +5144,7 @@
           <w:sz w:val="22"/>
           <w:szCs w:val="22"/>
         </w:rPr>
-        <w:t>Manual baseline: 7h</w:t>
-      </w:r>
-      <w:r>
-        <w:rPr>
-          <w:sz w:val="22"/>
-          <w:szCs w:val="22"/>
-        </w:rPr>
-        <w:t>/</w:t>
-      </w:r>
-      <w:r>
-        <w:rPr>
-          <w:sz w:val="22"/>
-          <w:szCs w:val="22"/>
-        </w:rPr>
-        <w:t xml:space="preserve">week </w:t>
-      </w:r>
-      <w:r>
-        <w:rPr>
-          <w:sz w:val="22"/>
-          <w:szCs w:val="22"/>
-        </w:rPr>
-        <w:t>*</w:t>
-      </w:r>
-      <w:r>
-        <w:rPr>
-          <w:sz w:val="22"/>
-          <w:szCs w:val="22"/>
-        </w:rPr>
-        <w:t xml:space="preserve"> 52 = 364h/year</w:t>
+        <w:t>Manual baseline reduced by 30%: 14 × 0.7 = 9.8 h/week → 509.6 h/year</w:t>
       </w:r>
     </w:p>
     <w:p>
@@ -4416,7 +5159,14 @@
           <w:sz w:val="22"/>
           <w:szCs w:val="22"/>
         </w:rPr>
-        <w:t>Time saved: (364</w:t>
+        <w:t>Time saved: (</w:t>
+      </w:r>
+      <w:r>
+        <w:rPr>
+          <w:sz w:val="22"/>
+          <w:szCs w:val="22"/>
+        </w:rPr>
+        <w:t>509.6</w:t>
       </w:r>
       <w:r>
         <w:rPr>
@@ -4453,7 +5203,14 @@
           <w:sz w:val="22"/>
           <w:szCs w:val="22"/>
         </w:rPr>
-        <w:t xml:space="preserve"> 50 = 13000</w:t>
+        <w:t xml:space="preserve"> 50 = </w:t>
+      </w:r>
+      <w:r>
+        <w:rPr>
+          <w:sz w:val="22"/>
+          <w:szCs w:val="22"/>
+        </w:rPr>
+        <w:t>20280</w:t>
       </w:r>
       <w:r>
         <w:rPr>
@@ -4482,7 +5239,22 @@
           <w:sz w:val="22"/>
           <w:szCs w:val="22"/>
         </w:rPr>
-        <w:t>Year 1 Benefits = 13000 + 16000 =</w:t>
+        <w:lastRenderedPageBreak/>
+        <w:t xml:space="preserve">Year 1 Benefits = </w:t>
+      </w:r>
+      <w:r>
+        <w:rPr>
+          <w:sz w:val="22"/>
+          <w:szCs w:val="22"/>
+        </w:rPr>
+        <w:t>20280</w:t>
+      </w:r>
+      <w:r>
+        <w:rPr>
+          <w:sz w:val="22"/>
+          <w:szCs w:val="22"/>
+        </w:rPr>
+        <w:t xml:space="preserve"> + 16000 =</w:t>
       </w:r>
       <w:r>
         <w:rPr>
@@ -4496,7 +5268,7 @@
           <w:sz w:val="22"/>
           <w:szCs w:val="22"/>
         </w:rPr>
-        <w:t>29000</w:t>
+        <w:t>36280</w:t>
       </w:r>
       <w:r>
         <w:rPr>
@@ -4518,7 +5290,21 @@
           <w:sz w:val="22"/>
           <w:szCs w:val="22"/>
         </w:rPr>
-        <w:t xml:space="preserve">Year 1 ROI = (29000 </w:t>
+        <w:t>Year 1 ROI = (</w:t>
+      </w:r>
+      <w:r>
+        <w:rPr>
+          <w:sz w:val="22"/>
+          <w:szCs w:val="22"/>
+        </w:rPr>
+        <w:t>36280</w:t>
+      </w:r>
+      <w:r>
+        <w:rPr>
+          <w:sz w:val="22"/>
+          <w:szCs w:val="22"/>
+        </w:rPr>
+        <w:t xml:space="preserve"> </w:t>
       </w:r>
       <w:r>
         <w:rPr>
@@ -4532,7 +5318,35 @@
           <w:sz w:val="22"/>
           <w:szCs w:val="22"/>
         </w:rPr>
-        <w:t xml:space="preserve">7500) / 7500 </w:t>
+        <w:t>7</w:t>
+      </w:r>
+      <w:r>
+        <w:rPr>
+          <w:sz w:val="22"/>
+          <w:szCs w:val="22"/>
+        </w:rPr>
+        <w:t>3</w:t>
+      </w:r>
+      <w:r>
+        <w:rPr>
+          <w:sz w:val="22"/>
+          <w:szCs w:val="22"/>
+        </w:rPr>
+        <w:t>00) / 7</w:t>
+      </w:r>
+      <w:r>
+        <w:rPr>
+          <w:sz w:val="22"/>
+          <w:szCs w:val="22"/>
+        </w:rPr>
+        <w:t>3</w:t>
+      </w:r>
+      <w:r>
+        <w:rPr>
+          <w:sz w:val="22"/>
+          <w:szCs w:val="22"/>
+        </w:rPr>
+        <w:t xml:space="preserve">00 </w:t>
       </w:r>
       <w:r>
         <w:rPr>
@@ -4546,7 +5360,21 @@
           <w:sz w:val="22"/>
           <w:szCs w:val="22"/>
         </w:rPr>
-        <w:t xml:space="preserve"> 100 = 287%</w:t>
+        <w:t xml:space="preserve"> 100 = </w:t>
+      </w:r>
+      <w:r>
+        <w:rPr>
+          <w:sz w:val="22"/>
+          <w:szCs w:val="22"/>
+        </w:rPr>
+        <w:t>397</w:t>
+      </w:r>
+      <w:r>
+        <w:rPr>
+          <w:sz w:val="22"/>
+          <w:szCs w:val="22"/>
+        </w:rPr>
+        <w:t>%</w:t>
       </w:r>
     </w:p>
     <w:p>
@@ -4806,6 +5634,13 @@
         </w:rPr>
         <w:t xml:space="preserve"> check is cheaper to do manually.</w:t>
       </w:r>
+      <w:r>
+        <w:rPr>
+          <w:sz w:val="22"/>
+          <w:szCs w:val="22"/>
+        </w:rPr>
+        <w:t xml:space="preserve"> </w:t>
+      </w:r>
     </w:p>
     <w:p>
       <w:pPr>
@@ -4814,10 +5649,339 @@
           <w:szCs w:val="22"/>
         </w:rPr>
       </w:pPr>
+      <w:r>
+        <w:rPr>
+          <w:sz w:val="22"/>
+          <w:szCs w:val="22"/>
+        </w:rPr>
+        <w:t>It</w:t>
+      </w:r>
+      <w:r>
+        <w:rPr>
+          <w:sz w:val="22"/>
+          <w:szCs w:val="22"/>
+        </w:rPr>
+        <w:t xml:space="preserve"> might</w:t>
+      </w:r>
+      <w:r>
+        <w:rPr>
+          <w:sz w:val="22"/>
+          <w:szCs w:val="22"/>
+        </w:rPr>
+        <w:t xml:space="preserve"> be</w:t>
+      </w:r>
+      <w:r>
+        <w:rPr>
+          <w:sz w:val="22"/>
+          <w:szCs w:val="22"/>
+        </w:rPr>
+        <w:t xml:space="preserve"> argue</w:t>
+      </w:r>
+      <w:r>
+        <w:rPr>
+          <w:sz w:val="22"/>
+          <w:szCs w:val="22"/>
+        </w:rPr>
+        <w:t>d that</w:t>
+      </w:r>
+      <w:r>
+        <w:rPr>
+          <w:sz w:val="22"/>
+          <w:szCs w:val="22"/>
+        </w:rPr>
+        <w:t xml:space="preserve"> manual checks could catch the same incidents, so why</w:t>
+      </w:r>
+      <w:r>
+        <w:rPr>
+          <w:sz w:val="22"/>
+          <w:szCs w:val="22"/>
+        </w:rPr>
+        <w:t xml:space="preserve"> would we want to</w:t>
+      </w:r>
+      <w:r>
+        <w:rPr>
+          <w:sz w:val="22"/>
+          <w:szCs w:val="22"/>
+        </w:rPr>
+        <w:t xml:space="preserve"> count avoided incidents as an automation benefit? The difference is coverage and consistency. Manual validation</w:t>
+      </w:r>
+      <w:r>
+        <w:rPr>
+          <w:sz w:val="22"/>
+          <w:szCs w:val="22"/>
+        </w:rPr>
+        <w:t xml:space="preserve"> part from t</w:t>
+      </w:r>
+      <w:r>
+        <w:rPr>
+          <w:sz w:val="22"/>
+          <w:szCs w:val="22"/>
+        </w:rPr>
+        <w:t>ask 2</w:t>
+      </w:r>
+      <w:r>
+        <w:rPr>
+          <w:sz w:val="22"/>
+          <w:szCs w:val="22"/>
+        </w:rPr>
+        <w:t xml:space="preserve"> shows that it</w:t>
+      </w:r>
+      <w:r>
+        <w:rPr>
+          <w:sz w:val="22"/>
+          <w:szCs w:val="22"/>
+        </w:rPr>
+        <w:t xml:space="preserve"> only happens twice a week</w:t>
+      </w:r>
+      <w:r>
+        <w:rPr>
+          <w:sz w:val="22"/>
+          <w:szCs w:val="22"/>
+        </w:rPr>
+        <w:t xml:space="preserve">, </w:t>
+      </w:r>
+      <w:r>
+        <w:rPr>
+          <w:sz w:val="22"/>
+          <w:szCs w:val="22"/>
+        </w:rPr>
+        <w:t xml:space="preserve">meaning any bad aggregate introduced on an "off day" has up to several days to reach the HTML report and executives before anyone </w:t>
+      </w:r>
+      <w:r>
+        <w:rPr>
+          <w:sz w:val="22"/>
+          <w:szCs w:val="22"/>
+        </w:rPr>
+        <w:t>finds out</w:t>
+      </w:r>
+      <w:r>
+        <w:rPr>
+          <w:sz w:val="22"/>
+          <w:szCs w:val="22"/>
+        </w:rPr>
+        <w:t xml:space="preserve">. Automated checks run on every single pipeline execution (daily), </w:t>
+      </w:r>
+      <w:r>
+        <w:rPr>
+          <w:sz w:val="22"/>
+          <w:szCs w:val="22"/>
+        </w:rPr>
+        <w:t xml:space="preserve">fixing that issue completely.  </w:t>
+      </w:r>
+      <w:r>
+        <w:rPr>
+          <w:sz w:val="22"/>
+          <w:szCs w:val="22"/>
+        </w:rPr>
+        <w:t>The 4000</w:t>
+      </w:r>
+      <w:r>
+        <w:rPr>
+          <w:sz w:val="22"/>
+          <w:szCs w:val="22"/>
+        </w:rPr>
+        <w:t xml:space="preserve"> euros </w:t>
+      </w:r>
+      <w:r>
+        <w:rPr>
+          <w:sz w:val="22"/>
+          <w:szCs w:val="22"/>
+        </w:rPr>
+        <w:t>per</w:t>
+      </w:r>
+      <w:r>
+        <w:rPr>
+          <w:sz w:val="22"/>
+          <w:szCs w:val="22"/>
+        </w:rPr>
+        <w:t xml:space="preserve"> </w:t>
+      </w:r>
+      <w:r>
+        <w:rPr>
+          <w:sz w:val="22"/>
+          <w:szCs w:val="22"/>
+        </w:rPr>
+        <w:t>incident</w:t>
+      </w:r>
+      <w:r>
+        <w:rPr>
+          <w:sz w:val="22"/>
+          <w:szCs w:val="22"/>
+        </w:rPr>
+        <w:t xml:space="preserve"> </w:t>
+      </w:r>
+      <w:r>
+        <w:rPr>
+          <w:sz w:val="22"/>
+          <w:szCs w:val="22"/>
+        </w:rPr>
+        <w:t xml:space="preserve">cost </w:t>
+      </w:r>
+      <w:r>
+        <w:rPr>
+          <w:sz w:val="22"/>
+          <w:szCs w:val="22"/>
+        </w:rPr>
+        <w:t xml:space="preserve">argued on that task </w:t>
+      </w:r>
+      <w:r>
+        <w:rPr>
+          <w:sz w:val="22"/>
+          <w:szCs w:val="22"/>
+        </w:rPr>
+        <w:t>specifically assumes late detection</w:t>
+      </w:r>
+      <w:r>
+        <w:rPr>
+          <w:sz w:val="22"/>
+          <w:szCs w:val="22"/>
+        </w:rPr>
+        <w:t xml:space="preserve">, (an </w:t>
+      </w:r>
+      <w:r>
+        <w:rPr>
+          <w:sz w:val="22"/>
+          <w:szCs w:val="22"/>
+        </w:rPr>
+        <w:t>incident already reached the report</w:t>
+      </w:r>
+      <w:r>
+        <w:rPr>
+          <w:sz w:val="22"/>
+          <w:szCs w:val="22"/>
+        </w:rPr>
+        <w:t>)</w:t>
+      </w:r>
+      <w:r>
+        <w:rPr>
+          <w:sz w:val="22"/>
+          <w:szCs w:val="22"/>
+        </w:rPr>
+        <w:t xml:space="preserve">. </w:t>
+      </w:r>
+      <w:proofErr w:type="spellStart"/>
+      <w:proofErr w:type="gramStart"/>
+      <w:r>
+        <w:rPr>
+          <w:sz w:val="22"/>
+          <w:szCs w:val="22"/>
+        </w:rPr>
+        <w:t>Its</w:t>
+      </w:r>
+      <w:proofErr w:type="spellEnd"/>
+      <w:proofErr w:type="gramEnd"/>
+      <w:r>
+        <w:rPr>
+          <w:sz w:val="22"/>
+          <w:szCs w:val="22"/>
+        </w:rPr>
+        <w:t xml:space="preserve"> not that a</w:t>
+      </w:r>
+      <w:r>
+        <w:rPr>
+          <w:sz w:val="22"/>
+          <w:szCs w:val="22"/>
+        </w:rPr>
+        <w:t>utomati</w:t>
+      </w:r>
+      <w:r>
+        <w:rPr>
+          <w:sz w:val="22"/>
+          <w:szCs w:val="22"/>
+        </w:rPr>
+        <w:t xml:space="preserve">ng the system </w:t>
+      </w:r>
+      <w:r>
+        <w:rPr>
+          <w:sz w:val="22"/>
+          <w:szCs w:val="22"/>
+        </w:rPr>
+        <w:t xml:space="preserve">catches something manual checks </w:t>
+      </w:r>
+      <w:r>
+        <w:rPr>
+          <w:sz w:val="22"/>
+          <w:szCs w:val="22"/>
+        </w:rPr>
+        <w:t>don’t</w:t>
+      </w:r>
+      <w:r>
+        <w:rPr>
+          <w:sz w:val="22"/>
+          <w:szCs w:val="22"/>
+        </w:rPr>
+        <w:t xml:space="preserve"> eventually</w:t>
+      </w:r>
+      <w:r>
+        <w:rPr>
+          <w:sz w:val="22"/>
+          <w:szCs w:val="22"/>
+        </w:rPr>
+        <w:t xml:space="preserve"> </w:t>
+      </w:r>
+      <w:r>
+        <w:rPr>
+          <w:sz w:val="22"/>
+          <w:szCs w:val="22"/>
+        </w:rPr>
+        <w:t>catch</w:t>
+      </w:r>
+      <w:r>
+        <w:rPr>
+          <w:sz w:val="22"/>
+          <w:szCs w:val="22"/>
+        </w:rPr>
+        <w:t>,</w:t>
+      </w:r>
+      <w:r>
+        <w:rPr>
+          <w:sz w:val="22"/>
+          <w:szCs w:val="22"/>
+        </w:rPr>
+        <w:t xml:space="preserve"> i</w:t>
+      </w:r>
+      <w:proofErr w:type="spellStart"/>
+      <w:r>
+        <w:rPr>
+          <w:sz w:val="22"/>
+          <w:szCs w:val="22"/>
+        </w:rPr>
+        <w:t>ts</w:t>
+      </w:r>
+      <w:proofErr w:type="spellEnd"/>
+      <w:r>
+        <w:rPr>
+          <w:sz w:val="22"/>
+          <w:szCs w:val="22"/>
+        </w:rPr>
+        <w:t xml:space="preserve"> that it catches it immediately</w:t>
+      </w:r>
+      <w:r>
+        <w:rPr>
+          <w:sz w:val="22"/>
+          <w:szCs w:val="22"/>
+        </w:rPr>
+        <w:t xml:space="preserve">, </w:t>
+      </w:r>
+      <w:r>
+        <w:rPr>
+          <w:sz w:val="22"/>
+          <w:szCs w:val="22"/>
+        </w:rPr>
+        <w:t xml:space="preserve">without depending on whether a human happened to validate that day. </w:t>
+      </w:r>
     </w:p>
     <w:p>
       <w:pPr>
         <w:rPr>
+          <w:sz w:val="22"/>
+          <w:szCs w:val="22"/>
+        </w:rPr>
+      </w:pPr>
+    </w:p>
+    <w:p>
+      <w:pPr>
+        <w:rPr>
           <w:b/>
           <w:bCs/>
           <w:sz w:val="22"/>
@@ -4833,7 +5997,6 @@
           <w:szCs w:val="22"/>
           <w:u w:val="single"/>
         </w:rPr>
-        <w:lastRenderedPageBreak/>
         <w:t>Stakeholder Pitch</w:t>
       </w:r>
     </w:p>
@@ -4849,7 +6012,21 @@
           <w:sz w:val="22"/>
           <w:szCs w:val="22"/>
         </w:rPr>
-        <w:t>To the facility reporting owner: investing roughly 4400</w:t>
+        <w:t>To the facility reporting owner: investing roughly 4</w:t>
+      </w:r>
+      <w:r>
+        <w:rPr>
+          <w:sz w:val="22"/>
+          <w:szCs w:val="22"/>
+        </w:rPr>
+        <w:t>2</w:t>
+      </w:r>
+      <w:r>
+        <w:rPr>
+          <w:sz w:val="22"/>
+          <w:szCs w:val="22"/>
+        </w:rPr>
+        <w:t>00</w:t>
       </w:r>
       <w:r>
         <w:rPr>
@@ -5051,7 +6228,21 @@
           <w:sz w:val="22"/>
           <w:szCs w:val="22"/>
         </w:rPr>
-        <w:t xml:space="preserve">, up to 9 euros by year 3. </w:t>
+        <w:t>, up to 9</w:t>
+      </w:r>
+      <w:r>
+        <w:rPr>
+          <w:sz w:val="22"/>
+          <w:szCs w:val="22"/>
+        </w:rPr>
+        <w:t>-10</w:t>
+      </w:r>
+      <w:r>
+        <w:rPr>
+          <w:sz w:val="22"/>
+          <w:szCs w:val="22"/>
+        </w:rPr>
+        <w:t xml:space="preserve"> euros by year 3. </w:t>
       </w:r>
       <w:r>
         <w:rPr>
@@ -5132,6 +6323,279 @@
     </w:sectPr>
   </w:body>
 </w:document>
+</file>
+
+<file path=word/numbering.xml><?xml version="1.0" encoding="utf-8"?>
+<w:numbering xmlns:wpc="http://schemas.microsoft.com/office/word/2010/wordprocessingCanvas" xmlns:cx="http://schemas.microsoft.com/office/drawing/2014/chartex" xmlns:cx1="http://schemas.microsoft.com/office/drawing/2015/9/8/chartex" xmlns:cx2="http://schemas.microsoft.com/office/drawing/2015/10/21/chartex" xmlns:cx3="http://schemas.microsoft.com/office/drawing/2016/5/9/chartex" xmlns:cx4="http://schemas.microsoft.com/office/drawing/2016/5/10/chartex" xmlns:cx5="http://schemas.microsoft.com/office/drawing/2016/5/11/chartex" xmlns:cx6="http://schemas.microsoft.com/office/drawing/2016/5/12/chartex" xmlns:cx7="http://schemas.microsoft.com/office/drawing/2016/5/13/chartex" xmlns:cx8="http://schemas.microsoft.com/office/drawing/2016/5/14/chartex" xmlns:mc="http://schemas.openxmlformats.org/markup-compatibility/2006" xmlns:m="http://schemas.openxmlformats.org/officeDocument/2006/math" xmlns:aink="http://schemas.microsoft.com/office/drawing/2016/ink" xmlns:am3d="http://schemas.microsoft.com/office/drawing/2017/model3d" xmlns:oel="http://schemas.microsoft.com/office/2019/extlst" xmlns:r="http://schemas.openxmlformats.org/officeDocument/2006/relationships" xmlns:wp14="http://schemas.microsoft.com/office/word/2010/wordprocessingDrawing" xmlns:wp="http://schemas.openxmlformats.org/drawingml/2006/wordprocessingDrawing" xmlns:wpg="http://schemas.microsoft.com/office/word/2010/wordprocessingGroup" xmlns:wpi="http://schemas.microsoft.com/office/word/2010/wordprocessingInk" xmlns:wps="http://schemas.microsoft.com/office/word/2010/wordprocessingShape" xmlns:o="urn:schemas-microsoft-com:office:office" xmlns:v="urn:schemas-microsoft-com:vml" xmlns:w10="urn:schemas-microsoft-com:office:word" xmlns:w="http://schemas.openxmlformats.org/wordprocessingml/2006/main" xmlns:w14="http://schemas.microsoft.com/office/word/2010/wordml" xmlns:w15="http://schemas.microsoft.com/office/word/2012/wordml" xmlns:w16cex="http://schemas.microsoft.com/office/word/2018/wordml/cex" xmlns:w16cid="http://schemas.microsoft.com/office/word/2016/wordml/cid" xmlns:w16="http://schemas.microsoft.com/office/word/2018/wordml" xmlns:w16sdtdh="http://schemas.microsoft.com/office/word/2020/wordml/sdtdatahash" xmlns:w16sdtfl="http://schemas.microsoft.com/office/word/2024/wordml/sdtformatlock" xmlns:w16se="http://schemas.microsoft.com/office/word/2015/wordml/symex" xmlns:w16du="http://schemas.microsoft.com/office/word/2023/wordml/word16du" xmlns:wne="http://schemas.microsoft.com/office/word/2006/wordml" mc:Ignorable="w14 w15 w16se w16cid w16 w16cex w16sdtdh w16sdtfl w16du wp14">
+  <w:abstractNum w:abstractNumId="0" w15:restartNumberingAfterBreak="0">
+    <w:nsid w:val="40960BEB"/>
+    <w:multiLevelType w:val="multilevel"/>
+    <w:tmpl w:val="E76A60DA"/>
+    <w:lvl w:ilvl="0">
+      <w:start w:val="1"/>
+      <w:numFmt w:val="bullet"/>
+      <w:lvlText w:val=""/>
+      <w:lvlJc w:val="left"/>
+      <w:pPr>
+        <w:tabs>
+          <w:tab w:val="num" w:pos="720"/>
+        </w:tabs>
+        <w:ind w:left="720" w:hanging="360"/>
+      </w:pPr>
+      <w:rPr>
+        <w:rFonts w:ascii="Symbol" w:hAnsi="Symbol" w:hint="default"/>
+        <w:sz w:val="20"/>
+      </w:rPr>
+    </w:lvl>
+    <w:lvl w:ilvl="1" w:tentative="1">
+      <w:start w:val="1"/>
+      <w:numFmt w:val="bullet"/>
+      <w:lvlText w:val="o"/>
+      <w:lvlJc w:val="left"/>
+      <w:pPr>
+        <w:tabs>
+          <w:tab w:val="num" w:pos="1440"/>
+        </w:tabs>
+        <w:ind w:left="1440" w:hanging="360"/>
+      </w:pPr>
+      <w:rPr>
+        <w:rFonts w:ascii="Courier New" w:hAnsi="Courier New" w:hint="default"/>
+        <w:sz w:val="20"/>
+      </w:rPr>
+    </w:lvl>
+    <w:lvl w:ilvl="2" w:tentative="1">
+      <w:start w:val="1"/>
+      <w:numFmt w:val="bullet"/>
+      <w:lvlText w:val=""/>
+      <w:lvlJc w:val="left"/>
+      <w:pPr>
+        <w:tabs>
+          <w:tab w:val="num" w:pos="2160"/>
+        </w:tabs>
+        <w:ind w:left="2160" w:hanging="360"/>
+      </w:pPr>
+      <w:rPr>
+        <w:rFonts w:ascii="Wingdings" w:hAnsi="Wingdings" w:hint="default"/>
+        <w:sz w:val="20"/>
+      </w:rPr>
+    </w:lvl>
+    <w:lvl w:ilvl="3" w:tentative="1">
+      <w:start w:val="1"/>
+      <w:numFmt w:val="bullet"/>
+      <w:lvlText w:val=""/>
+      <w:lvlJc w:val="left"/>
+      <w:pPr>
+        <w:tabs>
+          <w:tab w:val="num" w:pos="2880"/>
+        </w:tabs>
+        <w:ind w:left="2880" w:hanging="360"/>
+      </w:pPr>
+      <w:rPr>
+        <w:rFonts w:ascii="Wingdings" w:hAnsi="Wingdings" w:hint="default"/>
+        <w:sz w:val="20"/>
+      </w:rPr>
+    </w:lvl>
+    <w:lvl w:ilvl="4" w:tentative="1">
+      <w:start w:val="1"/>
+      <w:numFmt w:val="bullet"/>
+      <w:lvlText w:val=""/>
+      <w:lvlJc w:val="left"/>
+      <w:pPr>
+        <w:tabs>
+          <w:tab w:val="num" w:pos="3600"/>
+        </w:tabs>
+        <w:ind w:left="3600" w:hanging="360"/>
+      </w:pPr>
+      <w:rPr>
+        <w:rFonts w:ascii="Wingdings" w:hAnsi="Wingdings" w:hint="default"/>
+        <w:sz w:val="20"/>
+      </w:rPr>
+    </w:lvl>
+    <w:lvl w:ilvl="5" w:tentative="1">
+      <w:start w:val="1"/>
+      <w:numFmt w:val="bullet"/>
+      <w:lvlText w:val=""/>
+      <w:lvlJc w:val="left"/>
+      <w:pPr>
+        <w:tabs>
+          <w:tab w:val="num" w:pos="4320"/>
+        </w:tabs>
+        <w:ind w:left="4320" w:hanging="360"/>
+      </w:pPr>
+      <w:rPr>
+        <w:rFonts w:ascii="Wingdings" w:hAnsi="Wingdings" w:hint="default"/>
+        <w:sz w:val="20"/>
+      </w:rPr>
+    </w:lvl>
+    <w:lvl w:ilvl="6" w:tentative="1">
+      <w:start w:val="1"/>
+      <w:numFmt w:val="bullet"/>
+      <w:lvlText w:val=""/>
+      <w:lvlJc w:val="left"/>
+      <w:pPr>
+        <w:tabs>
+          <w:tab w:val="num" w:pos="5040"/>
+        </w:tabs>
+        <w:ind w:left="5040" w:hanging="360"/>
+      </w:pPr>
+      <w:rPr>
+        <w:rFonts w:ascii="Wingdings" w:hAnsi="Wingdings" w:hint="default"/>
+        <w:sz w:val="20"/>
+      </w:rPr>
+    </w:lvl>
+    <w:lvl w:ilvl="7" w:tentative="1">
+      <w:start w:val="1"/>
+      <w:numFmt w:val="bullet"/>
+      <w:lvlText w:val=""/>
+      <w:lvlJc w:val="left"/>
+      <w:pPr>
+        <w:tabs>
+          <w:tab w:val="num" w:pos="5760"/>
+        </w:tabs>
+        <w:ind w:left="5760" w:hanging="360"/>
+      </w:pPr>
+      <w:rPr>
+        <w:rFonts w:ascii="Wingdings" w:hAnsi="Wingdings" w:hint="default"/>
+        <w:sz w:val="20"/>
+      </w:rPr>
+    </w:lvl>
+    <w:lvl w:ilvl="8" w:tentative="1">
+      <w:start w:val="1"/>
+      <w:numFmt w:val="bullet"/>
+      <w:lvlText w:val=""/>
+      <w:lvlJc w:val="left"/>
+      <w:pPr>
+        <w:tabs>
+          <w:tab w:val="num" w:pos="6480"/>
+        </w:tabs>
+        <w:ind w:left="6480" w:hanging="360"/>
+      </w:pPr>
+      <w:rPr>
+        <w:rFonts w:ascii="Wingdings" w:hAnsi="Wingdings" w:hint="default"/>
+        <w:sz w:val="20"/>
+      </w:rPr>
+    </w:lvl>
+  </w:abstractNum>
+  <w:abstractNum w:abstractNumId="1" w15:restartNumberingAfterBreak="0">
+    <w:nsid w:val="53FE7253"/>
+    <w:multiLevelType w:val="multilevel"/>
+    <w:tmpl w:val="3EA6E848"/>
+    <w:lvl w:ilvl="0">
+      <w:start w:val="1"/>
+      <w:numFmt w:val="decimal"/>
+      <w:lvlText w:val="%1."/>
+      <w:lvlJc w:val="left"/>
+      <w:pPr>
+        <w:tabs>
+          <w:tab w:val="num" w:pos="720"/>
+        </w:tabs>
+        <w:ind w:left="720" w:hanging="360"/>
+      </w:pPr>
+    </w:lvl>
+    <w:lvl w:ilvl="1" w:tentative="1">
+      <w:start w:val="1"/>
+      <w:numFmt w:val="decimal"/>
+      <w:lvlText w:val="%2."/>
+      <w:lvlJc w:val="left"/>
+      <w:pPr>
+        <w:tabs>
+          <w:tab w:val="num" w:pos="1440"/>
+        </w:tabs>
+        <w:ind w:left="1440" w:hanging="360"/>
+      </w:pPr>
+    </w:lvl>
+    <w:lvl w:ilvl="2" w:tentative="1">
+      <w:start w:val="1"/>
+      <w:numFmt w:val="decimal"/>
+      <w:lvlText w:val="%3."/>
+      <w:lvlJc w:val="left"/>
+      <w:pPr>
+        <w:tabs>
+          <w:tab w:val="num" w:pos="2160"/>
+        </w:tabs>
+        <w:ind w:left="2160" w:hanging="360"/>
+      </w:pPr>
+    </w:lvl>
+    <w:lvl w:ilvl="3" w:tentative="1">
+      <w:start w:val="1"/>
+      <w:numFmt w:val="decimal"/>
+      <w:lvlText w:val="%4."/>
+      <w:lvlJc w:val="left"/>
+      <w:pPr>
+        <w:tabs>
+          <w:tab w:val="num" w:pos="2880"/>
+        </w:tabs>
+        <w:ind w:left="2880" w:hanging="360"/>
+      </w:pPr>
+    </w:lvl>
+    <w:lvl w:ilvl="4" w:tentative="1">
+      <w:start w:val="1"/>
+      <w:numFmt w:val="decimal"/>
+      <w:lvlText w:val="%5."/>
+      <w:lvlJc w:val="left"/>
+      <w:pPr>
+        <w:tabs>
+          <w:tab w:val="num" w:pos="3600"/>
+        </w:tabs>
+        <w:ind w:left="3600" w:hanging="360"/>
+      </w:pPr>
+    </w:lvl>
+    <w:lvl w:ilvl="5" w:tentative="1">
+      <w:start w:val="1"/>
+      <w:numFmt w:val="decimal"/>
+      <w:lvlText w:val="%6."/>
+      <w:lvlJc w:val="left"/>
+      <w:pPr>
+        <w:tabs>
+          <w:tab w:val="num" w:pos="4320"/>
+        </w:tabs>
+        <w:ind w:left="4320" w:hanging="360"/>
+      </w:pPr>
+    </w:lvl>
+    <w:lvl w:ilvl="6" w:tentative="1">
+      <w:start w:val="1"/>
+      <w:numFmt w:val="decimal"/>
+      <w:lvlText w:val="%7."/>
+      <w:lvlJc w:val="left"/>
+      <w:pPr>
+        <w:tabs>
+          <w:tab w:val="num" w:pos="5040"/>
+        </w:tabs>
+        <w:ind w:left="5040" w:hanging="360"/>
+      </w:pPr>
+    </w:lvl>
+    <w:lvl w:ilvl="7" w:tentative="1">
+      <w:start w:val="1"/>
+      <w:numFmt w:val="decimal"/>
+      <w:lvlText w:val="%8."/>
+      <w:lvlJc w:val="left"/>
+      <w:pPr>
+        <w:tabs>
+          <w:tab w:val="num" w:pos="5760"/>
+        </w:tabs>
+        <w:ind w:left="5760" w:hanging="360"/>
+      </w:pPr>
+    </w:lvl>
+    <w:lvl w:ilvl="8" w:tentative="1">
+      <w:start w:val="1"/>
+      <w:numFmt w:val="decimal"/>
+      <w:lvlText w:val="%9."/>
+      <w:lvlJc w:val="left"/>
+      <w:pPr>
+        <w:tabs>
+          <w:tab w:val="num" w:pos="6480"/>
+        </w:tabs>
+        <w:ind w:left="6480" w:hanging="360"/>
+      </w:pPr>
+    </w:lvl>
+  </w:abstractNum>
+  <w:num w:numId="1" w16cid:durableId="1409764317">
+    <w:abstractNumId w:val="1"/>
+  </w:num>
+  <w:num w:numId="2" w16cid:durableId="168643686">
+    <w:abstractNumId w:val="0"/>
+  </w:num>
+</w:numbering>
 </file>
 
 <file path=word/styles.xml><?xml version="1.0" encoding="utf-8"?>
@@ -6392,7 +7856,7 @@
 </file>
 
 <file path=customXml/itemProps1.xml><?xml version="1.0" encoding="utf-8"?>
-<ds:datastoreItem xmlns:ds="http://schemas.openxmlformats.org/officeDocument/2006/customXml" ds:itemID="{D73227CA-583D-3343-8D0F-0D20178651AD}">
+<ds:datastoreItem xmlns:ds="http://schemas.openxmlformats.org/officeDocument/2006/customXml" ds:itemID="{B6D1B408-BFB9-D847-BCDC-B551DFF47A7A}">
   <ds:schemaRefs>
     <ds:schemaRef ds:uri="http://schemas.openxmlformats.org/officeDocument/2006/bibliography"/>
   </ds:schemaRefs>

</xml_diff>